<commit_message>
Add final PMDD poster on the author's earlier layout
Rebuilds the poster on the earlier PMDD poster file (headline-number
row, combined results panel, public health implications, QR reference
link) using the verified screening data and the co-author list. Adds
the co-authors to the manuscript and an updated reference list for the
QR-linked document.

Co-Authored-By: Claude Opus 5.5 <noreply@anthropic.com>
Claude-Session: https://claude.ai/code/session_01VkRRDHxfMApHVBQgQibkFd
</commit_message>
<xml_diff>
--- a/PMDD_Scoping_Review/PMDD_Scoping_Review_Manuscript.docx
+++ b/PMDD_Scoping_Review/PMDD_Scoping_Review_Manuscript.docx
@@ -28,7 +28,19 @@
           <w:b w:val="0"/>
           <w:i w:val="0"/>
         </w:rPr>
-        <w:t>Ifeoluwanimi P. Shobayo, BSc, MSPHc</w:t>
+        <w:t>Ifeoluwanimi P. Shobayo, MSPH, Chelsea R. Mazonde, MPH, Marylyn O. Oduneye, MSPH, Tahirou Diallo, MSPH, Fadzai G. Nyarugwe, MSPH, and Cynthia C. Ilechukwu, MSPH</w:t>
+      </w:r>
+    </w:p>
+    <w:p>
+      <w:pPr>
+        <w:jc w:val="center"/>
+      </w:pPr>
+      <w:r>
+        <w:rPr>
+          <w:b w:val="0"/>
+          <w:i w:val="0"/>
+        </w:rPr>
+        <w:t>Liberty University</w:t>
       </w:r>
     </w:p>
     <w:p>
@@ -39,7 +51,7 @@
           <w:color w:val="B45309"/>
           <w:sz w:val="22"/>
         </w:rPr>
-        <w:t>[AUTHOR NOTE – complete before submission: add all co-authors with credentials, affiliations (department, institution, city, country), corresponding-author contact, ORCID iDs, word count, and target-journal formatting.]</w:t>
+        <w:t>[AUTHOR NOTE – before submission: add department, city and country, corresponding-author contact, ORCID iDs and word count.]</w:t>
       </w:r>
     </w:p>
     <w:p>

</xml_diff>

<commit_message>
Clarify Figure 4 caption on poster and manuscript
Co-Authored-By: Claude Opus 5.5 <noreply@anthropic.com>
Claude-Session: https://claude.ai/code/session_01VkRRDHxfMApHVBQgQibkFd
</commit_message>
<xml_diff>
--- a/PMDD_Scoping_Review/PMDD_Scoping_Review_Manuscript.docx
+++ b/PMDD_Scoping_Review/PMDD_Scoping_Review_Manuscript.docx
@@ -3356,14 +3356,14 @@
           <w:b/>
           <w:i w:val="0"/>
         </w:rPr>
-        <w:t>Figure 4. Country Setting and World Bank Income Group of Included Studies.</w:t>
+        <w:t>Figure 4. Where the Included Studies Were Conducted, by Country Income Group.</w:t>
       </w:r>
       <w:r>
         <w:rPr>
           <w:b w:val="0"/>
           <w:i w:val="0"/>
         </w:rPr>
-        <w:t xml:space="preserve"> The map shows the 30 studies with an identifiable country setting; income groups follow the World Bank FY2027 classification.</w:t>
+        <w:t xml:space="preserve"> The map shows the 30 studies with a known country; the other 14 used online or multinational samples or did not report a location. Colors show each country’s World Bank FY2027 income group, a standard ranking of countries by average income.</w:t>
       </w:r>
       <w:r>
         <w:rPr>
@@ -3378,7 +3378,7 @@
           <w:b w:val="0"/>
           <w:i w:val="0"/>
         </w:rPr>
-        <w:t xml:space="preserve"> The other 14 studies used online or multinational samples or had no single setting in the available records. The high-income count includes 1 study from Hong Kong, China.</w:t>
+        <w:t xml:space="preserve"> The high-income count includes 1 study from Hong Kong, China.</w:t>
       </w:r>
     </w:p>
     <w:p>
@@ -6976,14 +6976,14 @@
           <w:b/>
           <w:i w:val="0"/>
         </w:rPr>
-        <w:t>Figure 4. Country Setting and World Bank Income Group of Included Studies.</w:t>
+        <w:t>Figure 4. Where the Included Studies Were Conducted, by Country Income Group.</w:t>
       </w:r>
       <w:r>
         <w:rPr>
           <w:b w:val="0"/>
           <w:i w:val="0"/>
         </w:rPr>
-        <w:t xml:space="preserve"> The map shows the 30 studies with an identifiable country setting; income groups follow the World Bank FY2027 classification.</w:t>
+        <w:t xml:space="preserve"> The map shows the 30 studies with a known country; the other 14 used online or multinational samples or did not report a location. Colors show each country’s World Bank FY2027 income group, a standard ranking of countries by average income.</w:t>
       </w:r>
       <w:r>
         <w:rPr>
@@ -6998,7 +6998,7 @@
           <w:b w:val="0"/>
           <w:i w:val="0"/>
         </w:rPr>
-        <w:t xml:space="preserve"> The other 14 studies used online or multinational samples or had no single setting in the available records. The high-income count includes 1 study from Hong Kong, China.</w:t>
+        <w:t xml:space="preserve"> The high-income count includes 1 study from Hong Kong, China.</w:t>
       </w:r>
     </w:p>
     <w:sectPr>

</xml_diff>